<commit_message>
Clarify game-specific SOP scope and unify Skill identifiers
</commit_message>
<xml_diff>
--- a/docs/game-coach-skills-report.docx
+++ b/docs/game-coach-skills-report.docx
@@ -7,7 +7,7 @@
         <w:pStyle w:val="Title"/>
       </w:pPr>
       <w:r>
-        <w:t>跨游戏 AI 教练知识感知与专家标注方案</w:t>
+        <w:t>游戏 AI 教练知识感知与专家标注 SOP</w:t>
       </w:r>
     </w:p>
     <w:p>
@@ -47,7 +47,12 @@
         <w:spacing w:after="100"/>
       </w:pPr>
       <w:r>
-        <w:t>结论：用三个职责单一的 Skill 组成教练能力链。观察提取 Skill 回答“授权视角里发生了什么”；专家复盘标注 Skill 把可观察事实与专家判断分别审定；知识教练 Skill 结合当前版本知识、观察和已发布判据给出回答、建议或训练计划。教练 Agent 编排会话与工具；权限、实时展示和知识发布由宿主服务执行。专家标注既能补强知识，又不会被误当成未经核实的实时状态。</w:t>
+        <w:t>结论：用三个职责单一的 Skill 定义可按游戏适配的 SOP。game-coach-perception 回答“授权视角里发生了什么”；game-coach-annotation 把可观察事实与专家判断分别审定；game-coach-kb 结合当前版本知识、观察和已发布判据给出回答、建议或训练计划。教练 Agent 编排会话与工具；权限、实时展示和知识发布由宿主服务执行。专家标注既能补强知识，又不会被误当成未经核实的实时状态。</w:t>
+      </w:r>
+    </w:p>
+    <w:p>
+      <w:r>
+        <w:t>本文提供可供游戏团队遵循的流程与接口规范。每个目标游戏需分别补齐知识、术语、状态来源、适配配置和评测；虚构示例仅用于说明 SOP，不代表已在多款真实游戏验证。</w:t>
       </w:r>
     </w:p>
     <w:p>
@@ -55,7 +60,7 @@
         <w:spacing w:after="100"/>
       </w:pPr>
       <w:r>
-        <w:t>本报告区分产品方公开资料、受访者自述、社区原型与研究基准。公开演示或作者报告不能直接证明识别率、幻觉率或跨游戏泛化；相关能力仍需目标游戏实测。</w:t>
+        <w:t>本报告区分产品方公开资料、受访者自述、社区原型与研究基准。公开演示或作者报告不能直接证明识别率、幻觉率或面向新游戏的适配效果；相关能力仍需目标游戏实测。</w:t>
       </w:r>
     </w:p>
     <w:p>
@@ -985,7 +990,7 @@
         <w:spacing w:after="100"/>
       </w:pPr>
       <w:r>
-        <w:t>这套升级不依赖必须做 3D 重建。若游戏已经提供合法状态 API，直接使用结构化状态；仅有画面时才做感知。3D 第一人称识别在同一观察 Skill 内增加相机、遮挡、方位与身份追踪适配，不让知识 Skill 自行“看图猜局势”。2026 年 GameplayQA 的 3D 视频评测仍显示多模态模型在时间定位、角色归因和动态状态上有明显缺口，[10] 因而这一边界有实际必要。</w:t>
+        <w:t>这套升级不依赖必须做 3D 重建。若游戏已经提供合法状态 API，直接使用结构化状态；仅有画面时才做感知。3D 第一人称识别在同一game-coach-perception 内增加相机、遮挡、方位与身份追踪适配，不让game-coach-kb 自行“看图猜局势”。2026 年 GameplayQA 的 3D 视频评测仍显示多模态模型在时间定位、角色归因和动态状态上有明显缺口，[10] 因而这一边界有实际必要。</w:t>
       </w:r>
     </w:p>
     <w:p>
@@ -1014,8 +1019,8 @@
       <w:r>
         <w:drawing>
           <wp:inline xmlns:a="http://schemas.openxmlformats.org/drawingml/2006/main" xmlns:pic="http://schemas.openxmlformats.org/drawingml/2006/picture">
-            <wp:extent cx="6048000" cy="2990400"/>
-            <wp:docPr id="1" name="Picture 1" descr="游戏输入经观察提取和条件核验进入知识教练；缺失状态时澄清、请求补充或静默。"/>
+            <wp:extent cx="6048000" cy="3158400"/>
+            <wp:docPr id="1" name="Picture 1" descr="game-coach-perception 提取观察，经条件核验进入 game-coach-kb；缺失状态时澄清、请求补充或静默。"/>
             <wp:cNvGraphicFramePr>
               <a:graphicFrameLocks noChangeAspect="1"/>
             </wp:cNvGraphicFramePr>
@@ -1035,7 +1040,7 @@
                   <pic:spPr>
                     <a:xfrm>
                       <a:off x="0" y="0"/>
-                      <a:ext cx="6048000" cy="2990400"/>
+                      <a:ext cx="6048000" cy="3158400"/>
                     </a:xfrm>
                     <a:prstGeom prst="rect"/>
                   </pic:spPr>
@@ -1059,7 +1064,7 @@
           <w:color w:val="000000"/>
           <w:sz w:val="18"/>
         </w:rPr>
-        <w:t>图 1 线上教练调用与回退流程</w:t>
+        <w:t>图 1 目标游戏的教练调用与回退 SOP</w:t>
       </w:r>
     </w:p>
     <w:tbl>
@@ -1069,9 +1074,9 @@
         <w:tblLook w:firstColumn="1" w:firstRow="1" w:lastColumn="0" w:lastRow="0" w:noHBand="0" w:noVBand="1" w:val="04A0"/>
       </w:tblPr>
       <w:tblGrid>
-        <w:gridCol w:w="1814"/>
-        <w:gridCol w:w="4195"/>
-        <w:gridCol w:w="3515"/>
+        <w:gridCol w:w="2721"/>
+        <w:gridCol w:w="3685"/>
+        <w:gridCol w:w="3118"/>
       </w:tblGrid>
       <w:tr>
         <w:trPr>
@@ -1079,7 +1084,7 @@
         </w:trPr>
         <w:tc>
           <w:tcPr>
-            <w:tcW w:type="dxa" w:w="1814"/>
+            <w:tcW w:type="dxa" w:w="2721"/>
             <w:vAlign w:val="center"/>
             <w:shd w:fill="263B53"/>
           </w:tcPr>
@@ -1100,7 +1105,7 @@
         </w:tc>
         <w:tc>
           <w:tcPr>
-            <w:tcW w:type="dxa" w:w="4195"/>
+            <w:tcW w:type="dxa" w:w="3685"/>
             <w:vAlign w:val="center"/>
             <w:shd w:fill="263B53"/>
           </w:tcPr>
@@ -1121,7 +1126,7 @@
         </w:tc>
         <w:tc>
           <w:tcPr>
-            <w:tcW w:type="dxa" w:w="3515"/>
+            <w:tcW w:type="dxa" w:w="3118"/>
             <w:vAlign w:val="center"/>
             <w:shd w:fill="263B53"/>
           </w:tcPr>
@@ -1147,7 +1152,7 @@
         </w:trPr>
         <w:tc>
           <w:tcPr>
-            <w:tcW w:type="dxa" w:w="1814"/>
+            <w:tcW w:type="dxa" w:w="2721"/>
             <w:vAlign w:val="center"/>
           </w:tcPr>
           <w:p>
@@ -1159,13 +1164,13 @@
                 <w:rFonts w:ascii="Arial Unicode MS" w:hAnsi="Arial Unicode MS"/>
                 <w:sz w:val="16"/>
               </w:rPr>
-              <w:t>观察提取 Skill</w:t>
+              <w:t>game-coach-perception</w:t>
             </w:r>
           </w:p>
         </w:tc>
         <w:tc>
           <w:tcPr>
-            <w:tcW w:type="dxa" w:w="4195"/>
+            <w:tcW w:type="dxa" w:w="3685"/>
             <w:vAlign w:val="center"/>
           </w:tcPr>
           <w:p>
@@ -1183,7 +1188,7 @@
         </w:tc>
         <w:tc>
           <w:tcPr>
-            <w:tcW w:type="dxa" w:w="3515"/>
+            <w:tcW w:type="dxa" w:w="3118"/>
             <w:vAlign w:val="center"/>
           </w:tcPr>
           <w:p>
@@ -1206,7 +1211,7 @@
         </w:trPr>
         <w:tc>
           <w:tcPr>
-            <w:tcW w:type="dxa" w:w="1814"/>
+            <w:tcW w:type="dxa" w:w="2721"/>
             <w:vAlign w:val="center"/>
             <w:shd w:fill="F2F5F8"/>
           </w:tcPr>
@@ -1219,13 +1224,13 @@
                 <w:rFonts w:ascii="Arial Unicode MS" w:hAnsi="Arial Unicode MS"/>
                 <w:sz w:val="16"/>
               </w:rPr>
-              <w:t>专家复盘标注 Skill</w:t>
+              <w:t>game-coach-annotation</w:t>
             </w:r>
           </w:p>
         </w:tc>
         <w:tc>
           <w:tcPr>
-            <w:tcW w:type="dxa" w:w="4195"/>
+            <w:tcW w:type="dxa" w:w="3685"/>
             <w:vAlign w:val="center"/>
             <w:shd w:fill="F2F5F8"/>
           </w:tcPr>
@@ -1244,7 +1249,7 @@
         </w:tc>
         <w:tc>
           <w:tcPr>
-            <w:tcW w:type="dxa" w:w="3515"/>
+            <w:tcW w:type="dxa" w:w="3118"/>
             <w:vAlign w:val="center"/>
             <w:shd w:fill="F2F5F8"/>
           </w:tcPr>
@@ -1268,7 +1273,7 @@
         </w:trPr>
         <w:tc>
           <w:tcPr>
-            <w:tcW w:type="dxa" w:w="1814"/>
+            <w:tcW w:type="dxa" w:w="2721"/>
             <w:vAlign w:val="center"/>
           </w:tcPr>
           <w:p>
@@ -1280,13 +1285,13 @@
                 <w:rFonts w:ascii="Arial Unicode MS" w:hAnsi="Arial Unicode MS"/>
                 <w:sz w:val="16"/>
               </w:rPr>
-              <w:t>知识教练 Skill</w:t>
+              <w:t>game-coach-kb</w:t>
             </w:r>
           </w:p>
         </w:tc>
         <w:tc>
           <w:tcPr>
-            <w:tcW w:type="dxa" w:w="4195"/>
+            <w:tcW w:type="dxa" w:w="3685"/>
             <w:vAlign w:val="center"/>
           </w:tcPr>
           <w:p>
@@ -1304,7 +1309,7 @@
         </w:tc>
         <w:tc>
           <w:tcPr>
-            <w:tcW w:type="dxa" w:w="3515"/>
+            <w:tcW w:type="dxa" w:w="3118"/>
             <w:vAlign w:val="center"/>
           </w:tcPr>
           <w:p>
@@ -1327,7 +1332,7 @@
         </w:trPr>
         <w:tc>
           <w:tcPr>
-            <w:tcW w:type="dxa" w:w="1814"/>
+            <w:tcW w:type="dxa" w:w="2721"/>
             <w:vAlign w:val="center"/>
             <w:shd w:fill="F2F5F8"/>
           </w:tcPr>
@@ -1346,7 +1351,7 @@
         </w:tc>
         <w:tc>
           <w:tcPr>
-            <w:tcW w:type="dxa" w:w="4195"/>
+            <w:tcW w:type="dxa" w:w="3685"/>
             <w:vAlign w:val="center"/>
             <w:shd w:fill="F2F5F8"/>
           </w:tcPr>
@@ -1365,7 +1370,7 @@
         </w:tc>
         <w:tc>
           <w:tcPr>
-            <w:tcW w:type="dxa" w:w="3515"/>
+            <w:tcW w:type="dxa" w:w="3118"/>
             <w:vAlign w:val="center"/>
             <w:shd w:fill="F2F5F8"/>
           </w:tcPr>
@@ -1403,7 +1408,7 @@
         <w:keepNext/>
       </w:pPr>
       <w:r>
-        <w:t>四  三条跨游戏使用路径</w:t>
+        <w:t>四  三类游戏场景的 SOP 适配示例</w:t>
       </w:r>
     </w:p>
     <w:p>
@@ -1420,7 +1425,7 @@
         <w:spacing w:after="100"/>
       </w:pPr>
       <w:r>
-        <w:t>玩家授权音频与屏幕，系统听到左侧疑似脚步。观察 Skill 只能输出“45.1 至 45.7 秒有左侧脚步线索”，标记 inferred，敌人身份与世界坐标为 unknown；知识 Skill 检索到“在某条件下防侧翼”的判据，也不能因此说“敌人就在墙后”。若尚无足够可见状态，玩家主动问可给条件式提醒，自动播报应静默。这同时避免把观战视角的隐藏信息交给对局玩家。</w:t>
+        <w:t>玩家授权音频与屏幕，系统听到左侧疑似脚步。game-coach-perception 只能输出“45.1 至 45.7 秒有左侧脚步线索”，标记 inferred，敌人身份与世界坐标为 unknown；game-coach-kb 检索到“在某条件下防侧翼”的判据，也不能因此说“敌人就在墙后”。若尚无足够可见状态，玩家主动问可给条件式提醒，自动播报应静默。这同时避免把观战视角的隐藏信息交给对局玩家。</w:t>
       </w:r>
     </w:p>
     <w:p>
@@ -1454,7 +1459,7 @@
         <w:spacing w:after="100"/>
       </w:pPr>
       <w:r>
-        <w:t>观察 Skill 将视频分段并保留全局时间与音画同步；知识 Skill 用各游戏的专项判据生成局部诊断，再对同一事件去重、汇总单场，只有多场可比记录足够时才形成长期训练计划。每一层都能回到具体片段和专家判据。豆包社区实践的分片 JSON 与分层汇总提供工程参考，[2] NVIDIA 的 PUBG Ally 提醒我们实时响应和慢分析需要分层，[6] 但这两类架构的效果仍须本项目独立测量。</w:t>
+        <w:t>game-coach-perception 将视频分段并保留全局时间与音画同步；game-coach-kb 用各游戏的专项判据生成局部诊断，再对同一事件去重、汇总单场，只有多场可比记录足够时才形成长期训练计划。每一层都能回到具体片段和专家判据。豆包社区实践的分片 JSON 与分层汇总提供工程参考，[2] NVIDIA 的 PUBG Ally 提醒我们实时响应和慢分析需要分层，[6] 但这两类架构的效果仍须本项目独立测量。</w:t>
       </w:r>
     </w:p>
     <w:p>
@@ -1471,7 +1476,7 @@
         <w:spacing w:after="100"/>
       </w:pPr>
       <w:r>
-        <w:t>第一步登记录像授权、游戏版本、模式、玩家或观战视角和全局时间，并记录抽样原因。第二步由观察 Skill 生成机器预标注，专家逐帧或按片段核对事实：对象、行为、数值、事件和时间段；看不清写 unknown。第三步专家在已核对事实上写判断、依据、适用条件、例外和其他合理选择。第四步对拟发布判据或独立测试答案安排另一位专家复核，分歧保留双方理由并仲裁。最后按对局和玩家隔离训练、调参与测试数据，再交独立服务决定是否训练模型或发布知识。</w:t>
+        <w:t>第一步登记录像授权、游戏版本、模式、玩家或观战视角和全局时间，并记录抽样原因。第二步由game-coach-perception 生成机器预标注，专家逐帧或按片段核对事实：对象、行为、数值、事件和时间段；看不清写 unknown。第三步专家在已核对事实上写判断、依据、适用条件、例外和其他合理选择。第四步对拟发布判据或独立测试答案安排另一位专家复核，分歧保留双方理由并仲裁。最后按对局和玩家隔离训练、调参与测试数据，再交独立服务决定是否训练模型或发布知识。</w:t>
       </w:r>
     </w:p>
     <w:p>
@@ -1483,8 +1488,8 @@
       <w:r>
         <w:drawing>
           <wp:inline xmlns:a="http://schemas.openxmlformats.org/drawingml/2006/main" xmlns:pic="http://schemas.openxmlformats.org/drawingml/2006/picture">
-            <wp:extent cx="6048000" cy="3830400"/>
-            <wp:docPr id="2" name="Picture 2" descr="机器预标注经专家事实核对、判断和独立复核后按对局与玩家隔离，分别进入训练、待审知识与独立测试。"/>
+            <wp:extent cx="6048000" cy="4032000"/>
+            <wp:docPr id="2" name="Picture 2" descr="game-coach-perception 生成机器预标注，game-coach-annotation 组织专家复核与分流；已发布判据供 game-coach-kb 调用。"/>
             <wp:cNvGraphicFramePr>
               <a:graphicFrameLocks noChangeAspect="1"/>
             </wp:cNvGraphicFramePr>
@@ -1504,7 +1509,7 @@
                   <pic:spPr>
                     <a:xfrm>
                       <a:off x="0" y="0"/>
-                      <a:ext cx="6048000" cy="3830400"/>
+                      <a:ext cx="6048000" cy="4032000"/>
                     </a:xfrm>
                     <a:prstGeom prst="rect"/>
                   </pic:spPr>
@@ -1528,7 +1533,7 @@
           <w:color w:val="000000"/>
           <w:sz w:val="18"/>
         </w:rPr>
-        <w:t>图 2 专家复盘标注与数据分流流程</w:t>
+        <w:t>图 2 目标游戏的专家标注与数据分流 SOP</w:t>
       </w:r>
     </w:p>
     <w:tbl>

</xml_diff>

<commit_message>
Restore Chinese Skill names and foreground knowledge management and application
</commit_message>
<xml_diff>
--- a/docs/game-coach-skills-report.docx
+++ b/docs/game-coach-skills-report.docx
@@ -7,7 +7,7 @@
         <w:pStyle w:val="Title"/>
       </w:pPr>
       <w:r>
-        <w:t>游戏 AI 教练知识感知与专家标注 SOP</w:t>
+        <w:t>游戏 AI 教练知识库管理与应用 Skill 方案</w:t>
       </w:r>
     </w:p>
     <w:p>
@@ -15,7 +15,7 @@
         <w:spacing w:after="100"/>
       </w:pPr>
       <w:r>
-        <w:t>公开产品与 GitHub 调研  三 Skill 分层  专家复盘标注  知识应用与评测</w:t>
+        <w:t>公开产品与 GitHub 调研  核心知识库管理与应用  配套观察提取及专家标注</w:t>
       </w:r>
     </w:p>
     <w:p>
@@ -47,12 +47,12 @@
         <w:spacing w:after="100"/>
       </w:pPr>
       <w:r>
-        <w:t>结论：用三个职责单一的 Skill 定义可按游戏适配的 SOP。game-coach-perception 回答“授权视角里发生了什么”；game-coach-annotation 把可观察事实与专家判断分别审定；game-coach-kb 结合当前版本知识、观察和已发布判据给出回答、建议或训练计划。教练 Agent 编排会话与工具；权限、实时展示和知识发布由宿主服务执行。专家标注既能补强知识，又不会被误当成未经核实的实时状态。</w:t>
+        <w:t>本方案的核心是“游戏 AI 教练知识库管理与应用 Skill”（game-coach-kb），覆盖知识接入、来源治理、版本更新、审核发布、检索应用和持续评测。“游戏观察提取 Skill”（game-coach-perception）提供动态观察输入；“专家复盘标注 Skill”（game-coach-annotation）把复盘素材转为经复核的事实标签和专家知识候选。两项配套能力用于完善核心 Skill 的输入、知识生产与质量验证。教练 Agent 编排会话与工具，宿主服务执行权限、展示和发布。</w:t>
       </w:r>
     </w:p>
     <w:p>
       <w:r>
-        <w:t>本文提供可供游戏团队遵循的流程与接口规范。每个目标游戏需分别补齐知识、术语、状态来源、适配配置和评测；虚构示例仅用于说明 SOP，不代表已在多款真实游戏验证。</w:t>
+        <w:t>本文提供可供游戏团队按需适配的 Skill 方案。每个目标游戏需分别补齐知识、术语、状态来源、适配配置和评测；虚构示例仅说明流程用法，不代表已在多款真实游戏验证。</w:t>
       </w:r>
     </w:p>
     <w:p>
@@ -990,7 +990,7 @@
         <w:spacing w:after="100"/>
       </w:pPr>
       <w:r>
-        <w:t>这套升级不依赖必须做 3D 重建。若游戏已经提供合法状态 API，直接使用结构化状态；仅有画面时才做感知。3D 第一人称识别在同一game-coach-perception 内增加相机、遮挡、方位与身份追踪适配，不让game-coach-kb 自行“看图猜局势”。2026 年 GameplayQA 的 3D 视频评测仍显示多模态模型在时间定位、角色归因和动态状态上有明显缺口，[10] 因而这一边界有实际必要。</w:t>
+        <w:t>这套升级不依赖必须做 3D 重建。若游戏已经提供合法状态 API，直接使用结构化状态；仅有画面时才做感知。3D 第一人称识别在同一游戏观察提取 Skill 内增加相机、遮挡、方位与身份追踪适配，不让游戏 AI 教练知识库管理与应用 Skill 自行“看图猜局势”。2026 年 GameplayQA 的 3D 视频评测仍显示多模态模型在时间定位、角色归因和动态状态上有明显缺口，[10] 因而这一边界有实际必要。</w:t>
       </w:r>
     </w:p>
     <w:p>
@@ -999,7 +999,7 @@
         <w:keepNext/>
       </w:pPr>
       <w:r>
-        <w:t>三  三个 Skill 的系统契约</w:t>
+        <w:t>三  核心 Skill 与配套 Skill 的系统契约</w:t>
       </w:r>
     </w:p>
     <w:p>
@@ -1157,14 +1157,16 @@
           </w:tcPr>
           <w:p>
             <w:pPr>
-              <w:spacing w:after="0" w:line="259" w:lineRule="auto"/>
+              <w:spacing w:after="0"/>
             </w:pPr>
             <w:r>
               <w:rPr>
                 <w:rFonts w:ascii="Arial Unicode MS" w:hAnsi="Arial Unicode MS"/>
                 <w:sz w:val="16"/>
               </w:rPr>
-              <w:t>game-coach-perception</w:t>
+              <w:t>游戏观察提取 Skill</w:t>
+              <w:br/>
+              <w:t>（game-coach-perception）</w:t>
             </w:r>
           </w:p>
         </w:tc>
@@ -1217,14 +1219,16 @@
           </w:tcPr>
           <w:p>
             <w:pPr>
-              <w:spacing w:after="0" w:line="259" w:lineRule="auto"/>
+              <w:spacing w:after="0"/>
             </w:pPr>
             <w:r>
               <w:rPr>
                 <w:rFonts w:ascii="Arial Unicode MS" w:hAnsi="Arial Unicode MS"/>
                 <w:sz w:val="16"/>
               </w:rPr>
-              <w:t>game-coach-annotation</w:t>
+              <w:t>专家复盘标注 Skill</w:t>
+              <w:br/>
+              <w:t>（game-coach-annotation）</w:t>
             </w:r>
           </w:p>
         </w:tc>
@@ -1278,14 +1282,16 @@
           </w:tcPr>
           <w:p>
             <w:pPr>
-              <w:spacing w:after="0" w:line="259" w:lineRule="auto"/>
+              <w:spacing w:after="0"/>
             </w:pPr>
             <w:r>
               <w:rPr>
                 <w:rFonts w:ascii="Arial Unicode MS" w:hAnsi="Arial Unicode MS"/>
                 <w:sz w:val="16"/>
               </w:rPr>
-              <w:t>game-coach-kb</w:t>
+              <w:t>核心：游戏 AI 教练知识库管理与应用 Skill</w:t>
+              <w:br/>
+              <w:t>（game-coach-kb）</w:t>
             </w:r>
           </w:p>
         </w:tc>
@@ -1408,7 +1414,7 @@
         <w:keepNext/>
       </w:pPr>
       <w:r>
-        <w:t>四  三类游戏场景的 SOP 适配示例</w:t>
+        <w:t>四  三类游戏场景的 Skill 适配示例</w:t>
       </w:r>
     </w:p>
     <w:p>
@@ -1425,7 +1431,7 @@
         <w:spacing w:after="100"/>
       </w:pPr>
       <w:r>
-        <w:t>玩家授权音频与屏幕，系统听到左侧疑似脚步。game-coach-perception 只能输出“45.1 至 45.7 秒有左侧脚步线索”，标记 inferred，敌人身份与世界坐标为 unknown；game-coach-kb 检索到“在某条件下防侧翼”的判据，也不能因此说“敌人就在墙后”。若尚无足够可见状态，玩家主动问可给条件式提醒，自动播报应静默。这同时避免把观战视角的隐藏信息交给对局玩家。</w:t>
+        <w:t>玩家授权音频与屏幕，系统听到左侧疑似脚步。游戏观察提取 Skill 只能输出“45.1 至 45.7 秒有左侧脚步线索”，标记 inferred，敌人身份与世界坐标为 unknown；游戏 AI 教练知识库管理与应用 Skill 检索到“在某条件下防侧翼”的判据，也不能因此说“敌人就在墙后”。若尚无足够可见状态，玩家主动问可给条件式提醒，自动播报应静默。这同时避免把观战视角的隐藏信息交给对局玩家。</w:t>
       </w:r>
     </w:p>
     <w:p>
@@ -1459,7 +1465,7 @@
         <w:spacing w:after="100"/>
       </w:pPr>
       <w:r>
-        <w:t>game-coach-perception 将视频分段并保留全局时间与音画同步；game-coach-kb 用各游戏的专项判据生成局部诊断，再对同一事件去重、汇总单场，只有多场可比记录足够时才形成长期训练计划。每一层都能回到具体片段和专家判据。豆包社区实践的分片 JSON 与分层汇总提供工程参考，[2] NVIDIA 的 PUBG Ally 提醒我们实时响应和慢分析需要分层，[6] 但这两类架构的效果仍须本项目独立测量。</w:t>
+        <w:t>游戏观察提取 Skill 将视频分段并保留全局时间与音画同步；游戏 AI 教练知识库管理与应用 Skill 用各游戏的专项判据生成局部诊断，再对同一事件去重、汇总单场，只有多场可比记录足够时才形成长期训练计划。每一层都能回到具体片段和专家判据。豆包社区实践的分片 JSON 与分层汇总提供工程参考，[2] NVIDIA 的 PUBG Ally 提醒我们实时响应和慢分析需要分层，[6] 但这两类架构的效果仍须本项目独立测量。</w:t>
       </w:r>
     </w:p>
     <w:p>
@@ -1476,7 +1482,7 @@
         <w:spacing w:after="100"/>
       </w:pPr>
       <w:r>
-        <w:t>第一步登记录像授权、游戏版本、模式、玩家或观战视角和全局时间，并记录抽样原因。第二步由game-coach-perception 生成机器预标注，专家逐帧或按片段核对事实：对象、行为、数值、事件和时间段；看不清写 unknown。第三步专家在已核对事实上写判断、依据、适用条件、例外和其他合理选择。第四步对拟发布判据或独立测试答案安排另一位专家复核，分歧保留双方理由并仲裁。最后按对局和玩家隔离训练、调参与测试数据，再交独立服务决定是否训练模型或发布知识。</w:t>
+        <w:t>第一步登记录像授权、游戏版本、模式、玩家或观战视角和全局时间，并记录抽样原因。第二步由游戏观察提取 Skill 生成机器预标注，专家逐帧或按片段核对事实：对象、行为、数值、事件和时间段；看不清写 unknown。第三步专家在已核对事实上写判断、依据、适用条件、例外和其他合理选择。第四步对拟发布判据或独立测试答案安排另一位专家复核，分歧保留双方理由并仲裁。最后按对局和玩家隔离训练、调参与测试数据，再交独立服务决定是否训练模型或发布知识。</w:t>
       </w:r>
     </w:p>
     <w:p>

</xml_diff>

<commit_message>
Add Biped knowledge Skill demo with real model traces and release exercise
</commit_message>
<xml_diff>
--- a/docs/game-coach-skills-report.docx
+++ b/docs/game-coach-skills-report.docx
@@ -1853,7 +1853,7 @@
         <w:spacing w:after="100"/>
       </w:pPr>
       <w:r>
-        <w:t>交付包提供三个独立 Skill、共用观察包 Schema、标注案例 Schema、虚构双游戏示例及静态校验。静态检查只证明文件、字段和样本结构有效；没有腾讯内部接口、真实授权录像和目标模型运行结果时，不能承诺识别率、低延迟或玩家水平提升。</w:t>
+        <w:t>交付包提供三个独立 Skill、共用观察包 Schema、标注案例 Schema、虚构双游戏示例及静态校验，并新增 Biped 公开知识离线 Demo 与真实模型运行记录。Demo 验证知识问答、回退和知识补录，详见附录。尚无腾讯内部接口或真实授权录像，不能承诺识别率、实时响应或玩家水平提升。</w:t>
       </w:r>
     </w:p>
     <w:p>
@@ -2127,6 +2127,1132 @@
       <w:r>
         <w:t xml:space="preserve">  Description、单一职责、示例、检查点与工程化评测。</w:t>
       </w:r>
+    </w:p>
+    <w:p>
+      <w:pPr>
+        <w:pStyle w:val="Heading1"/>
+        <w:pageBreakBefore/>
+      </w:pPr>
+      <w:r>
+        <w:rPr>
+          <w:color w:val="000000"/>
+        </w:rPr>
+        <w:t>附录一 Biped 公开知识 Demo</w:t>
+      </w:r>
+    </w:p>
+    <w:p>
+      <w:pPr>
+        <w:spacing w:after="120" w:line="269" w:lineRule="auto"/>
+      </w:pPr>
+      <w:r>
+        <w:t>为验证核心 Skill 的实际用法，本次选择腾讯 NExT Studios 的《只只大冒险 / Biped》第一部。它允许把验证范围收窄到操作与合作入门。这里没有统计全网资料量，也没有假设已覆盖所有关卡攻略。</w:t>
+      </w:r>
+    </w:p>
+    <w:p>
+      <w:pPr>
+        <w:spacing w:after="120" w:line="269" w:lineRule="auto"/>
+      </w:pPr>
+      <w:r>
+        <w:t>Demo 从部分种子知识开始：seed-v1 包含 4 张卡片；enriched-v2 补入 1 张官方设备说明卡。每张卡保留来源、定位、适用范围、核对日期与发布状态。规则范围 biped-steam-public-docs 表示第一部 Steam PC 的公开说明，不是游戏补丁号；未识别用户安装版本。</w:t>
+      </w:r>
+    </w:p>
+    <w:p>
+      <w:pPr>
+        <w:pStyle w:val="Heading2"/>
+        <w:pageBreakBefore w:val="0"/>
+      </w:pPr>
+      <w:r>
+        <w:rPr>
+          <w:color w:val="000000"/>
+        </w:rPr>
+        <w:t>模型与 harness</w:t>
+      </w:r>
+    </w:p>
+    <w:tbl>
+      <w:tblPr>
+        <w:tblW w:type="auto" w:w="0"/>
+        <w:jc w:val="center"/>
+        <w:tblLayout w:type="fixed"/>
+        <w:tblLook w:firstColumn="1" w:firstRow="1" w:lastColumn="0" w:lastRow="0" w:noHBand="0" w:noVBand="1" w:val="04A0"/>
+      </w:tblPr>
+      <w:tblGrid>
+        <w:gridCol w:w="1474"/>
+        <w:gridCol w:w="8391"/>
+      </w:tblGrid>
+      <w:tr>
+        <w:tc>
+          <w:tcPr>
+            <w:tcW w:type="dxa" w:w="1474"/>
+            <w:vAlign w:val="center"/>
+            <w:tcBorders>
+              <w:top w:val="single" w:sz="4" w:color="D9D9D9"/>
+              <w:left w:val="single" w:sz="4" w:color="D9D9D9"/>
+              <w:bottom w:val="single" w:sz="4" w:color="D9D9D9"/>
+              <w:right w:val="single" w:sz="4" w:color="D9D9D9"/>
+            </w:tcBorders>
+            <w:tcMar>
+              <w:top w:w="90" w:type="dxa"/>
+              <w:left w:w="90" w:type="dxa"/>
+              <w:bottom w:w="90" w:type="dxa"/>
+              <w:right w:w="90" w:type="dxa"/>
+            </w:tcMar>
+            <w:shd w:fill="E8ECE8"/>
+          </w:tcPr>
+          <w:p>
+            <w:pPr>
+              <w:spacing w:after="20" w:before="20" w:line="264" w:lineRule="auto"/>
+            </w:pPr>
+            <w:r>
+              <w:rPr>
+                <w:b/>
+                <w:color w:val="000000"/>
+                <w:sz w:val="18"/>
+              </w:rPr>
+              <w:t>项目</w:t>
+            </w:r>
+          </w:p>
+        </w:tc>
+        <w:tc>
+          <w:tcPr>
+            <w:tcW w:type="dxa" w:w="8391"/>
+            <w:vAlign w:val="center"/>
+            <w:tcBorders>
+              <w:top w:val="single" w:sz="4" w:color="D9D9D9"/>
+              <w:left w:val="single" w:sz="4" w:color="D9D9D9"/>
+              <w:bottom w:val="single" w:sz="4" w:color="D9D9D9"/>
+              <w:right w:val="single" w:sz="4" w:color="D9D9D9"/>
+            </w:tcBorders>
+            <w:tcMar>
+              <w:top w:w="90" w:type="dxa"/>
+              <w:left w:w="90" w:type="dxa"/>
+              <w:bottom w:w="90" w:type="dxa"/>
+              <w:right w:w="90" w:type="dxa"/>
+            </w:tcMar>
+            <w:shd w:fill="E8ECE8"/>
+          </w:tcPr>
+          <w:p>
+            <w:pPr>
+              <w:spacing w:after="20" w:before="20" w:line="264" w:lineRule="auto"/>
+            </w:pPr>
+            <w:r>
+              <w:rPr>
+                <w:b/>
+                <w:color w:val="000000"/>
+                <w:sz w:val="18"/>
+              </w:rPr>
+              <w:t>本次实际配置</w:t>
+            </w:r>
+          </w:p>
+        </w:tc>
+      </w:tr>
+      <w:tr>
+        <w:tc>
+          <w:tcPr>
+            <w:tcW w:type="dxa" w:w="1474"/>
+            <w:vAlign w:val="center"/>
+            <w:tcBorders>
+              <w:top w:val="single" w:sz="4" w:color="D9D9D9"/>
+              <w:left w:val="single" w:sz="4" w:color="D9D9D9"/>
+              <w:bottom w:val="single" w:sz="4" w:color="D9D9D9"/>
+              <w:right w:val="single" w:sz="4" w:color="D9D9D9"/>
+            </w:tcBorders>
+            <w:tcMar>
+              <w:top w:w="90" w:type="dxa"/>
+              <w:left w:w="90" w:type="dxa"/>
+              <w:bottom w:w="90" w:type="dxa"/>
+              <w:right w:w="90" w:type="dxa"/>
+            </w:tcMar>
+          </w:tcPr>
+          <w:p>
+            <w:pPr>
+              <w:spacing w:after="20" w:before="20" w:line="264" w:lineRule="auto"/>
+            </w:pPr>
+            <w:r>
+              <w:rPr>
+                <w:b w:val="0"/>
+                <w:color w:val="000000"/>
+                <w:sz w:val="18"/>
+              </w:rPr>
+              <w:t>模型</w:t>
+            </w:r>
+          </w:p>
+        </w:tc>
+        <w:tc>
+          <w:tcPr>
+            <w:tcW w:type="dxa" w:w="8391"/>
+            <w:vAlign w:val="center"/>
+            <w:tcBorders>
+              <w:top w:val="single" w:sz="4" w:color="D9D9D9"/>
+              <w:left w:val="single" w:sz="4" w:color="D9D9D9"/>
+              <w:bottom w:val="single" w:sz="4" w:color="D9D9D9"/>
+              <w:right w:val="single" w:sz="4" w:color="D9D9D9"/>
+            </w:tcBorders>
+            <w:tcMar>
+              <w:top w:w="90" w:type="dxa"/>
+              <w:left w:w="90" w:type="dxa"/>
+              <w:bottom w:w="90" w:type="dxa"/>
+              <w:right w:w="90" w:type="dxa"/>
+            </w:tcMar>
+          </w:tcPr>
+          <w:p>
+            <w:pPr>
+              <w:spacing w:after="20" w:before="20" w:line="264" w:lineRule="auto"/>
+            </w:pPr>
+            <w:r>
+              <w:rPr>
+                <w:b w:val="0"/>
+                <w:color w:val="000000"/>
+                <w:sz w:val="18"/>
+              </w:rPr>
+              <w:t>gpt-6.1-sol 显式请求别名；CLI 未返回不可变后端快照 ID</w:t>
+            </w:r>
+          </w:p>
+        </w:tc>
+      </w:tr>
+      <w:tr>
+        <w:tc>
+          <w:tcPr>
+            <w:tcW w:type="dxa" w:w="1474"/>
+            <w:vAlign w:val="center"/>
+            <w:tcBorders>
+              <w:top w:val="single" w:sz="4" w:color="D9D9D9"/>
+              <w:left w:val="single" w:sz="4" w:color="D9D9D9"/>
+              <w:bottom w:val="single" w:sz="4" w:color="D9D9D9"/>
+              <w:right w:val="single" w:sz="4" w:color="D9D9D9"/>
+            </w:tcBorders>
+            <w:tcMar>
+              <w:top w:w="90" w:type="dxa"/>
+              <w:left w:w="90" w:type="dxa"/>
+              <w:bottom w:w="90" w:type="dxa"/>
+              <w:right w:w="90" w:type="dxa"/>
+            </w:tcMar>
+          </w:tcPr>
+          <w:p>
+            <w:pPr>
+              <w:spacing w:after="20" w:before="20" w:line="264" w:lineRule="auto"/>
+            </w:pPr>
+            <w:r>
+              <w:rPr>
+                <w:b w:val="0"/>
+                <w:color w:val="000000"/>
+                <w:sz w:val="18"/>
+              </w:rPr>
+              <w:t>模型运行时</w:t>
+            </w:r>
+          </w:p>
+        </w:tc>
+        <w:tc>
+          <w:tcPr>
+            <w:tcW w:type="dxa" w:w="8391"/>
+            <w:vAlign w:val="center"/>
+            <w:tcBorders>
+              <w:top w:val="single" w:sz="4" w:color="D9D9D9"/>
+              <w:left w:val="single" w:sz="4" w:color="D9D9D9"/>
+              <w:bottom w:val="single" w:sz="4" w:color="D9D9D9"/>
+              <w:right w:val="single" w:sz="4" w:color="D9D9D9"/>
+            </w:tcBorders>
+            <w:tcMar>
+              <w:top w:w="90" w:type="dxa"/>
+              <w:left w:w="90" w:type="dxa"/>
+              <w:bottom w:w="90" w:type="dxa"/>
+              <w:right w:w="90" w:type="dxa"/>
+            </w:tcMar>
+          </w:tcPr>
+          <w:p>
+            <w:pPr>
+              <w:spacing w:after="20" w:before="20" w:line="264" w:lineRule="auto"/>
+            </w:pPr>
+            <w:r>
+              <w:rPr>
+                <w:b w:val="0"/>
+                <w:color w:val="000000"/>
+                <w:sz w:val="18"/>
+              </w:rPr>
+              <w:t>Codex CLI 0.163.0-alpha.10.2，复用本机 ChatGPT 登录</w:t>
+            </w:r>
+          </w:p>
+        </w:tc>
+      </w:tr>
+      <w:tr>
+        <w:tc>
+          <w:tcPr>
+            <w:tcW w:type="dxa" w:w="1474"/>
+            <w:vAlign w:val="center"/>
+            <w:tcBorders>
+              <w:top w:val="single" w:sz="4" w:color="D9D9D9"/>
+              <w:left w:val="single" w:sz="4" w:color="D9D9D9"/>
+              <w:bottom w:val="single" w:sz="4" w:color="D9D9D9"/>
+              <w:right w:val="single" w:sz="4" w:color="D9D9D9"/>
+            </w:tcBorders>
+            <w:tcMar>
+              <w:top w:w="90" w:type="dxa"/>
+              <w:left w:w="90" w:type="dxa"/>
+              <w:bottom w:w="90" w:type="dxa"/>
+              <w:right w:w="90" w:type="dxa"/>
+            </w:tcMar>
+          </w:tcPr>
+          <w:p>
+            <w:pPr>
+              <w:spacing w:after="20" w:before="20" w:line="264" w:lineRule="auto"/>
+            </w:pPr>
+            <w:r>
+              <w:rPr>
+                <w:b w:val="0"/>
+                <w:color w:val="000000"/>
+                <w:sz w:val="18"/>
+              </w:rPr>
+              <w:t>harness</w:t>
+            </w:r>
+          </w:p>
+        </w:tc>
+        <w:tc>
+          <w:tcPr>
+            <w:tcW w:type="dxa" w:w="8391"/>
+            <w:vAlign w:val="center"/>
+            <w:tcBorders>
+              <w:top w:val="single" w:sz="4" w:color="D9D9D9"/>
+              <w:left w:val="single" w:sz="4" w:color="D9D9D9"/>
+              <w:bottom w:val="single" w:sz="4" w:color="D9D9D9"/>
+              <w:right w:val="single" w:sz="4" w:color="D9D9D9"/>
+            </w:tcBorders>
+            <w:tcMar>
+              <w:top w:w="90" w:type="dxa"/>
+              <w:left w:w="90" w:type="dxa"/>
+              <w:bottom w:w="90" w:type="dxa"/>
+              <w:right w:w="90" w:type="dxa"/>
+            </w:tcMar>
+          </w:tcPr>
+          <w:p>
+            <w:pPr>
+              <w:spacing w:after="20" w:before="20" w:line="264" w:lineRule="auto"/>
+            </w:pPr>
+            <w:r>
+              <w:rPr>
+                <w:b w:val="0"/>
+                <w:color w:val="000000"/>
+                <w:sz w:val="18"/>
+              </w:rPr>
+              <w:t>biped-rag-harness-1.0，Python 标准库编排；推理强度 low</w:t>
+            </w:r>
+          </w:p>
+        </w:tc>
+      </w:tr>
+      <w:tr>
+        <w:tc>
+          <w:tcPr>
+            <w:tcW w:type="dxa" w:w="1474"/>
+            <w:vAlign w:val="center"/>
+            <w:tcBorders>
+              <w:top w:val="single" w:sz="4" w:color="D9D9D9"/>
+              <w:left w:val="single" w:sz="4" w:color="D9D9D9"/>
+              <w:bottom w:val="single" w:sz="4" w:color="D9D9D9"/>
+              <w:right w:val="single" w:sz="4" w:color="D9D9D9"/>
+            </w:tcBorders>
+            <w:tcMar>
+              <w:top w:w="90" w:type="dxa"/>
+              <w:left w:w="90" w:type="dxa"/>
+              <w:bottom w:w="90" w:type="dxa"/>
+              <w:right w:w="90" w:type="dxa"/>
+            </w:tcMar>
+          </w:tcPr>
+          <w:p>
+            <w:pPr>
+              <w:spacing w:after="20" w:before="20" w:line="264" w:lineRule="auto"/>
+            </w:pPr>
+            <w:r>
+              <w:rPr>
+                <w:b w:val="0"/>
+                <w:color w:val="000000"/>
+                <w:sz w:val="18"/>
+              </w:rPr>
+              <w:t>Skill 加载</w:t>
+            </w:r>
+          </w:p>
+        </w:tc>
+        <w:tc>
+          <w:tcPr>
+            <w:tcW w:type="dxa" w:w="8391"/>
+            <w:vAlign w:val="center"/>
+            <w:tcBorders>
+              <w:top w:val="single" w:sz="4" w:color="D9D9D9"/>
+              <w:left w:val="single" w:sz="4" w:color="D9D9D9"/>
+              <w:bottom w:val="single" w:sz="4" w:color="D9D9D9"/>
+              <w:right w:val="single" w:sz="4" w:color="D9D9D9"/>
+            </w:tcBorders>
+            <w:tcMar>
+              <w:top w:w="90" w:type="dxa"/>
+              <w:left w:w="90" w:type="dxa"/>
+              <w:bottom w:w="90" w:type="dxa"/>
+              <w:right w:w="90" w:type="dxa"/>
+            </w:tcMar>
+          </w:tcPr>
+          <w:p>
+            <w:pPr>
+              <w:spacing w:after="20" w:before="20" w:line="264" w:lineRule="auto"/>
+            </w:pPr>
+            <w:r>
+              <w:rPr>
+                <w:b w:val="0"/>
+                <w:color w:val="000000"/>
+                <w:sz w:val="18"/>
+              </w:rPr>
+              <w:t>核心 Skill 6.2；显式注入 SKILL.md、runtime.md、contracts.md；保留哈希</w:t>
+            </w:r>
+          </w:p>
+        </w:tc>
+      </w:tr>
+      <w:tr>
+        <w:tc>
+          <w:tcPr>
+            <w:tcW w:type="dxa" w:w="1474"/>
+            <w:vAlign w:val="center"/>
+            <w:tcBorders>
+              <w:top w:val="single" w:sz="4" w:color="D9D9D9"/>
+              <w:left w:val="single" w:sz="4" w:color="D9D9D9"/>
+              <w:bottom w:val="single" w:sz="4" w:color="D9D9D9"/>
+              <w:right w:val="single" w:sz="4" w:color="D9D9D9"/>
+            </w:tcBorders>
+            <w:tcMar>
+              <w:top w:w="90" w:type="dxa"/>
+              <w:left w:w="90" w:type="dxa"/>
+              <w:bottom w:w="90" w:type="dxa"/>
+              <w:right w:w="90" w:type="dxa"/>
+            </w:tcMar>
+          </w:tcPr>
+          <w:p>
+            <w:pPr>
+              <w:spacing w:after="20" w:before="20" w:line="264" w:lineRule="auto"/>
+            </w:pPr>
+            <w:r>
+              <w:rPr>
+                <w:b w:val="0"/>
+                <w:color w:val="000000"/>
+                <w:sz w:val="18"/>
+              </w:rPr>
+              <w:t>检索与输出</w:t>
+            </w:r>
+          </w:p>
+        </w:tc>
+        <w:tc>
+          <w:tcPr>
+            <w:tcW w:type="dxa" w:w="8391"/>
+            <w:vAlign w:val="center"/>
+            <w:tcBorders>
+              <w:top w:val="single" w:sz="4" w:color="D9D9D9"/>
+              <w:left w:val="single" w:sz="4" w:color="D9D9D9"/>
+              <w:bottom w:val="single" w:sz="4" w:color="D9D9D9"/>
+              <w:right w:val="single" w:sz="4" w:color="D9D9D9"/>
+            </w:tcBorders>
+            <w:tcMar>
+              <w:top w:w="90" w:type="dxa"/>
+              <w:left w:w="90" w:type="dxa"/>
+              <w:bottom w:w="90" w:type="dxa"/>
+              <w:right w:w="90" w:type="dxa"/>
+            </w:tcMar>
+          </w:tcPr>
+          <w:p>
+            <w:pPr>
+              <w:spacing w:after="20" w:before="20" w:line="264" w:lineRule="auto"/>
+            </w:pPr>
+            <w:r>
+              <w:rPr>
+                <w:b w:val="0"/>
+                <w:color w:val="000000"/>
+                <w:sz w:val="18"/>
+              </w:rPr>
+              <w:t>宿主先过滤游戏、范围、模式、状态与快照，再关键词 top-3；模型输出结构化 JSON</w:t>
+            </w:r>
+          </w:p>
+        </w:tc>
+      </w:tr>
+      <w:tr>
+        <w:tc>
+          <w:tcPr>
+            <w:tcW w:type="dxa" w:w="1474"/>
+            <w:vAlign w:val="center"/>
+            <w:tcBorders>
+              <w:top w:val="single" w:sz="4" w:color="D9D9D9"/>
+              <w:left w:val="single" w:sz="4" w:color="D9D9D9"/>
+              <w:bottom w:val="single" w:sz="4" w:color="D9D9D9"/>
+              <w:right w:val="single" w:sz="4" w:color="D9D9D9"/>
+            </w:tcBorders>
+            <w:tcMar>
+              <w:top w:w="90" w:type="dxa"/>
+              <w:left w:w="90" w:type="dxa"/>
+              <w:bottom w:w="90" w:type="dxa"/>
+              <w:right w:w="90" w:type="dxa"/>
+            </w:tcMar>
+          </w:tcPr>
+          <w:p>
+            <w:pPr>
+              <w:spacing w:after="20" w:before="20" w:line="264" w:lineRule="auto"/>
+            </w:pPr>
+            <w:r>
+              <w:rPr>
+                <w:b w:val="0"/>
+                <w:color w:val="000000"/>
+                <w:sz w:val="18"/>
+              </w:rPr>
+              <w:t>调用边界</w:t>
+            </w:r>
+          </w:p>
+        </w:tc>
+        <w:tc>
+          <w:tcPr>
+            <w:tcW w:type="dxa" w:w="8391"/>
+            <w:vAlign w:val="center"/>
+            <w:tcBorders>
+              <w:top w:val="single" w:sz="4" w:color="D9D9D9"/>
+              <w:left w:val="single" w:sz="4" w:color="D9D9D9"/>
+              <w:bottom w:val="single" w:sz="4" w:color="D9D9D9"/>
+              <w:right w:val="single" w:sz="4" w:color="D9D9D9"/>
+            </w:tcBorders>
+            <w:tcMar>
+              <w:top w:w="90" w:type="dxa"/>
+              <w:left w:w="90" w:type="dxa"/>
+              <w:bottom w:w="90" w:type="dxa"/>
+              <w:right w:w="90" w:type="dxa"/>
+            </w:tcMar>
+          </w:tcPr>
+          <w:p>
+            <w:pPr>
+              <w:spacing w:after="20" w:before="20" w:line="264" w:lineRule="auto"/>
+            </w:pPr>
+            <w:r>
+              <w:rPr>
+                <w:b w:val="0"/>
+                <w:color w:val="000000"/>
+                <w:sz w:val="18"/>
+              </w:rPr>
+              <w:t>临时空目录、只读；关闭模型侧 shell、web、apps、plugins、multi_agent 和 hooks</w:t>
+            </w:r>
+          </w:p>
+        </w:tc>
+      </w:tr>
+    </w:tbl>
+    <w:p>
+      <w:pPr>
+        <w:spacing w:after="120" w:line="269" w:lineRule="auto"/>
+      </w:pPr>
+    </w:p>
+    <w:p>
+      <w:pPr>
+        <w:spacing w:after="120" w:line="269" w:lineRule="auto"/>
+      </w:pPr>
+      <w:r>
+        <w:t>harness 指负责组织输入、工具、模型调用、记录和检查的运行程序。宿主固定执行 get_context 与 search_knowledge，模型消费返回结果；本次没有测模型自主选工具或 Skill 自动触发。基线保留相同宿主、资料和输出结构，仅不加载本 Skill。</w:t>
+      </w:r>
+    </w:p>
+    <w:p>
+      <w:pPr>
+        <w:pStyle w:val="Heading2"/>
+        <w:pageBreakBefore w:val="0"/>
+      </w:pPr>
+      <w:r>
+        <w:rPr>
+          <w:color w:val="000000"/>
+        </w:rPr>
+        <w:t>两个可检查的应用片段</w:t>
+      </w:r>
+    </w:p>
+    <w:p>
+      <w:pPr>
+        <w:spacing w:after="120" w:line="269" w:lineRule="auto"/>
+      </w:pPr>
+      <w:r>
+        <w:t>缺局势时回退：玩家问“两个人下一脚分别踩哪里”，本库只有一般合作原则，没有关卡、站位和机关状态。Skill 组返回 clarify，记录 state_missing，并请求这些必要条件，没有给出确定落脚点。</w:t>
+      </w:r>
+    </w:p>
+    <w:p>
+      <w:pPr>
+        <w:spacing w:after="120" w:line="269" w:lineRule="auto"/>
+      </w:pPr>
+      <w:r>
+        <w:t>知识补录：同样问 Steam PC 本地双人能否只用两个鼠标，旧快照下模型承认证据不足；新增 K-LOCAL-INPUT 后，模型引用官方说明列出“一个手柄加一个鼠标”或“两个手柄”。两组均展示了这一变化，因此补录收益不能归于 Skill 单独贡献。</w:t>
+      </w:r>
+    </w:p>
+    <w:p>
+      <w:pPr>
+        <w:spacing w:after="120" w:line="269" w:lineRule="auto"/>
+      </w:pPr>
+      <w:r>
+        <w:t>页面回放实际保存的模型输出；本地 ask.py 可对新问题发起真实调用。本 Demo 未连接游戏状态、画面或操作控制，配套观察提取与专家标注 Skill 尚未实测。</w:t>
+      </w:r>
+    </w:p>
+    <w:p>
+      <w:pPr>
+        <w:pStyle w:val="Heading1"/>
+        <w:pageBreakBefore/>
+      </w:pPr>
+      <w:r>
+        <w:rPr>
+          <w:color w:val="000000"/>
+        </w:rPr>
+        <w:t>附录二 运行结果与更新演练</w:t>
+      </w:r>
+    </w:p>
+    <w:p>
+      <w:pPr>
+        <w:spacing w:after="120" w:line="269" w:lineRule="auto"/>
+      </w:pPr>
+      <w:r>
+        <w:t>2026 年 10 月 29 日对 11 个预设输入各运行两组，每组每条 1 次，共 22 次真实模型调用。输入、评分规则、知识、适配器、Skill 和 harness 均在运行前记录哈希。用例由开发者编写，没有独立盲测或领域专家验收。</w:t>
+      </w:r>
+    </w:p>
+    <w:tbl>
+      <w:tblPr>
+        <w:tblW w:type="auto" w:w="0"/>
+        <w:jc w:val="center"/>
+        <w:tblLayout w:type="fixed"/>
+        <w:tblLook w:firstColumn="1" w:firstRow="1" w:lastColumn="0" w:lastRow="0" w:noHBand="0" w:noVBand="1" w:val="04A0"/>
+      </w:tblPr>
+      <w:tblGrid>
+        <w:gridCol w:w="2494"/>
+        <w:gridCol w:w="1191"/>
+        <w:gridCol w:w="2948"/>
+        <w:gridCol w:w="3231"/>
+      </w:tblGrid>
+      <w:tr>
+        <w:tc>
+          <w:tcPr>
+            <w:tcW w:type="dxa" w:w="2494"/>
+            <w:vAlign w:val="center"/>
+            <w:tcBorders>
+              <w:top w:val="single" w:sz="4" w:color="D9D9D9"/>
+              <w:left w:val="single" w:sz="4" w:color="D9D9D9"/>
+              <w:bottom w:val="single" w:sz="4" w:color="D9D9D9"/>
+              <w:right w:val="single" w:sz="4" w:color="D9D9D9"/>
+            </w:tcBorders>
+            <w:tcMar>
+              <w:top w:w="90" w:type="dxa"/>
+              <w:left w:w="90" w:type="dxa"/>
+              <w:bottom w:w="90" w:type="dxa"/>
+              <w:right w:w="90" w:type="dxa"/>
+            </w:tcMar>
+            <w:shd w:fill="E8ECE8"/>
+          </w:tcPr>
+          <w:p>
+            <w:pPr>
+              <w:spacing w:after="20" w:before="20" w:line="264" w:lineRule="auto"/>
+            </w:pPr>
+            <w:r>
+              <w:rPr>
+                <w:b/>
+                <w:color w:val="000000"/>
+                <w:sz w:val="18"/>
+              </w:rPr>
+              <w:t>组别</w:t>
+            </w:r>
+          </w:p>
+        </w:tc>
+        <w:tc>
+          <w:tcPr>
+            <w:tcW w:type="dxa" w:w="1191"/>
+            <w:vAlign w:val="center"/>
+            <w:tcBorders>
+              <w:top w:val="single" w:sz="4" w:color="D9D9D9"/>
+              <w:left w:val="single" w:sz="4" w:color="D9D9D9"/>
+              <w:bottom w:val="single" w:sz="4" w:color="D9D9D9"/>
+              <w:right w:val="single" w:sz="4" w:color="D9D9D9"/>
+            </w:tcBorders>
+            <w:tcMar>
+              <w:top w:w="90" w:type="dxa"/>
+              <w:left w:w="90" w:type="dxa"/>
+              <w:bottom w:w="90" w:type="dxa"/>
+              <w:right w:w="90" w:type="dxa"/>
+            </w:tcMar>
+            <w:shd w:fill="E8ECE8"/>
+          </w:tcPr>
+          <w:p>
+            <w:pPr>
+              <w:spacing w:after="20" w:before="20" w:line="264" w:lineRule="auto"/>
+            </w:pPr>
+            <w:r>
+              <w:rPr>
+                <w:b/>
+                <w:color w:val="000000"/>
+                <w:sz w:val="18"/>
+              </w:rPr>
+              <w:t>输入数</w:t>
+            </w:r>
+          </w:p>
+        </w:tc>
+        <w:tc>
+          <w:tcPr>
+            <w:tcW w:type="dxa" w:w="2948"/>
+            <w:vAlign w:val="center"/>
+            <w:tcBorders>
+              <w:top w:val="single" w:sz="4" w:color="D9D9D9"/>
+              <w:left w:val="single" w:sz="4" w:color="D9D9D9"/>
+              <w:bottom w:val="single" w:sz="4" w:color="D9D9D9"/>
+              <w:right w:val="single" w:sz="4" w:color="D9D9D9"/>
+            </w:tcBorders>
+            <w:tcMar>
+              <w:top w:w="90" w:type="dxa"/>
+              <w:left w:w="90" w:type="dxa"/>
+              <w:bottom w:w="90" w:type="dxa"/>
+              <w:right w:w="90" w:type="dxa"/>
+            </w:tcMar>
+            <w:shd w:fill="E8ECE8"/>
+          </w:tcPr>
+          <w:p>
+            <w:pPr>
+              <w:spacing w:after="20" w:before="20" w:line="264" w:lineRule="auto"/>
+            </w:pPr>
+            <w:r>
+              <w:rPr>
+                <w:b/>
+                <w:color w:val="000000"/>
+                <w:sz w:val="18"/>
+              </w:rPr>
+              <w:t>完整契约检查</w:t>
+            </w:r>
+          </w:p>
+        </w:tc>
+        <w:tc>
+          <w:tcPr>
+            <w:tcW w:type="dxa" w:w="3231"/>
+            <w:vAlign w:val="center"/>
+            <w:tcBorders>
+              <w:top w:val="single" w:sz="4" w:color="D9D9D9"/>
+              <w:left w:val="single" w:sz="4" w:color="D9D9D9"/>
+              <w:bottom w:val="single" w:sz="4" w:color="D9D9D9"/>
+              <w:right w:val="single" w:sz="4" w:color="D9D9D9"/>
+            </w:tcBorders>
+            <w:tcMar>
+              <w:top w:w="90" w:type="dxa"/>
+              <w:left w:w="90" w:type="dxa"/>
+              <w:bottom w:w="90" w:type="dxa"/>
+              <w:right w:w="90" w:type="dxa"/>
+            </w:tcMar>
+            <w:shd w:fill="E8ECE8"/>
+          </w:tcPr>
+          <w:p>
+            <w:pPr>
+              <w:spacing w:after="20" w:before="20" w:line="264" w:lineRule="auto"/>
+            </w:pPr>
+            <w:r>
+              <w:rPr>
+                <w:b/>
+                <w:color w:val="000000"/>
+                <w:sz w:val="18"/>
+              </w:rPr>
+              <w:t>CLI 耗时中位数</w:t>
+            </w:r>
+          </w:p>
+        </w:tc>
+      </w:tr>
+      <w:tr>
+        <w:tc>
+          <w:tcPr>
+            <w:tcW w:type="dxa" w:w="2494"/>
+            <w:vAlign w:val="center"/>
+            <w:tcBorders>
+              <w:top w:val="single" w:sz="4" w:color="D9D9D9"/>
+              <w:left w:val="single" w:sz="4" w:color="D9D9D9"/>
+              <w:bottom w:val="single" w:sz="4" w:color="D9D9D9"/>
+              <w:right w:val="single" w:sz="4" w:color="D9D9D9"/>
+            </w:tcBorders>
+            <w:tcMar>
+              <w:top w:w="90" w:type="dxa"/>
+              <w:left w:w="90" w:type="dxa"/>
+              <w:bottom w:w="90" w:type="dxa"/>
+              <w:right w:w="90" w:type="dxa"/>
+            </w:tcMar>
+          </w:tcPr>
+          <w:p>
+            <w:pPr>
+              <w:spacing w:after="20" w:before="20" w:line="264" w:lineRule="auto"/>
+            </w:pPr>
+            <w:r>
+              <w:rPr>
+                <w:b w:val="0"/>
+                <w:color w:val="000000"/>
+                <w:sz w:val="18"/>
+              </w:rPr>
+              <w:t>普通 RAG</w:t>
+            </w:r>
+          </w:p>
+        </w:tc>
+        <w:tc>
+          <w:tcPr>
+            <w:tcW w:type="dxa" w:w="1191"/>
+            <w:vAlign w:val="center"/>
+            <w:tcBorders>
+              <w:top w:val="single" w:sz="4" w:color="D9D9D9"/>
+              <w:left w:val="single" w:sz="4" w:color="D9D9D9"/>
+              <w:bottom w:val="single" w:sz="4" w:color="D9D9D9"/>
+              <w:right w:val="single" w:sz="4" w:color="D9D9D9"/>
+            </w:tcBorders>
+            <w:tcMar>
+              <w:top w:w="90" w:type="dxa"/>
+              <w:left w:w="90" w:type="dxa"/>
+              <w:bottom w:w="90" w:type="dxa"/>
+              <w:right w:w="90" w:type="dxa"/>
+            </w:tcMar>
+          </w:tcPr>
+          <w:p>
+            <w:pPr>
+              <w:spacing w:after="20" w:before="20" w:line="264" w:lineRule="auto"/>
+            </w:pPr>
+            <w:r>
+              <w:rPr>
+                <w:b w:val="0"/>
+                <w:color w:val="000000"/>
+                <w:sz w:val="18"/>
+              </w:rPr>
+              <w:t>11</w:t>
+            </w:r>
+          </w:p>
+        </w:tc>
+        <w:tc>
+          <w:tcPr>
+            <w:tcW w:type="dxa" w:w="2948"/>
+            <w:vAlign w:val="center"/>
+            <w:tcBorders>
+              <w:top w:val="single" w:sz="4" w:color="D9D9D9"/>
+              <w:left w:val="single" w:sz="4" w:color="D9D9D9"/>
+              <w:bottom w:val="single" w:sz="4" w:color="D9D9D9"/>
+              <w:right w:val="single" w:sz="4" w:color="D9D9D9"/>
+            </w:tcBorders>
+            <w:tcMar>
+              <w:top w:w="90" w:type="dxa"/>
+              <w:left w:w="90" w:type="dxa"/>
+              <w:bottom w:w="90" w:type="dxa"/>
+              <w:right w:w="90" w:type="dxa"/>
+            </w:tcMar>
+          </w:tcPr>
+          <w:p>
+            <w:pPr>
+              <w:spacing w:after="20" w:before="20" w:line="264" w:lineRule="auto"/>
+            </w:pPr>
+            <w:r>
+              <w:rPr>
+                <w:b w:val="0"/>
+                <w:color w:val="000000"/>
+                <w:sz w:val="18"/>
+              </w:rPr>
+              <w:t>4/11</w:t>
+            </w:r>
+          </w:p>
+        </w:tc>
+        <w:tc>
+          <w:tcPr>
+            <w:tcW w:type="dxa" w:w="3231"/>
+            <w:vAlign w:val="center"/>
+            <w:tcBorders>
+              <w:top w:val="single" w:sz="4" w:color="D9D9D9"/>
+              <w:left w:val="single" w:sz="4" w:color="D9D9D9"/>
+              <w:bottom w:val="single" w:sz="4" w:color="D9D9D9"/>
+              <w:right w:val="single" w:sz="4" w:color="D9D9D9"/>
+            </w:tcBorders>
+            <w:tcMar>
+              <w:top w:w="90" w:type="dxa"/>
+              <w:left w:w="90" w:type="dxa"/>
+              <w:bottom w:w="90" w:type="dxa"/>
+              <w:right w:w="90" w:type="dxa"/>
+            </w:tcMar>
+          </w:tcPr>
+          <w:p>
+            <w:pPr>
+              <w:spacing w:after="20" w:before="20" w:line="264" w:lineRule="auto"/>
+            </w:pPr>
+            <w:r>
+              <w:rPr>
+                <w:b w:val="0"/>
+                <w:color w:val="000000"/>
+                <w:sz w:val="18"/>
+              </w:rPr>
+              <w:t>20.8 秒</w:t>
+            </w:r>
+          </w:p>
+        </w:tc>
+      </w:tr>
+      <w:tr>
+        <w:tc>
+          <w:tcPr>
+            <w:tcW w:type="dxa" w:w="2494"/>
+            <w:vAlign w:val="center"/>
+            <w:tcBorders>
+              <w:top w:val="single" w:sz="4" w:color="D9D9D9"/>
+              <w:left w:val="single" w:sz="4" w:color="D9D9D9"/>
+              <w:bottom w:val="single" w:sz="4" w:color="D9D9D9"/>
+              <w:right w:val="single" w:sz="4" w:color="D9D9D9"/>
+            </w:tcBorders>
+            <w:tcMar>
+              <w:top w:w="90" w:type="dxa"/>
+              <w:left w:w="90" w:type="dxa"/>
+              <w:bottom w:w="90" w:type="dxa"/>
+              <w:right w:w="90" w:type="dxa"/>
+            </w:tcMar>
+          </w:tcPr>
+          <w:p>
+            <w:pPr>
+              <w:spacing w:after="20" w:before="20" w:line="264" w:lineRule="auto"/>
+            </w:pPr>
+            <w:r>
+              <w:rPr>
+                <w:b w:val="0"/>
+                <w:color w:val="000000"/>
+                <w:sz w:val="18"/>
+              </w:rPr>
+              <w:t>加载核心 Skill</w:t>
+            </w:r>
+          </w:p>
+        </w:tc>
+        <w:tc>
+          <w:tcPr>
+            <w:tcW w:type="dxa" w:w="1191"/>
+            <w:vAlign w:val="center"/>
+            <w:tcBorders>
+              <w:top w:val="single" w:sz="4" w:color="D9D9D9"/>
+              <w:left w:val="single" w:sz="4" w:color="D9D9D9"/>
+              <w:bottom w:val="single" w:sz="4" w:color="D9D9D9"/>
+              <w:right w:val="single" w:sz="4" w:color="D9D9D9"/>
+            </w:tcBorders>
+            <w:tcMar>
+              <w:top w:w="90" w:type="dxa"/>
+              <w:left w:w="90" w:type="dxa"/>
+              <w:bottom w:w="90" w:type="dxa"/>
+              <w:right w:w="90" w:type="dxa"/>
+            </w:tcMar>
+          </w:tcPr>
+          <w:p>
+            <w:pPr>
+              <w:spacing w:after="20" w:before="20" w:line="264" w:lineRule="auto"/>
+            </w:pPr>
+            <w:r>
+              <w:rPr>
+                <w:b w:val="0"/>
+                <w:color w:val="000000"/>
+                <w:sz w:val="18"/>
+              </w:rPr>
+              <w:t>11</w:t>
+            </w:r>
+          </w:p>
+        </w:tc>
+        <w:tc>
+          <w:tcPr>
+            <w:tcW w:type="dxa" w:w="2948"/>
+            <w:vAlign w:val="center"/>
+            <w:tcBorders>
+              <w:top w:val="single" w:sz="4" w:color="D9D9D9"/>
+              <w:left w:val="single" w:sz="4" w:color="D9D9D9"/>
+              <w:bottom w:val="single" w:sz="4" w:color="D9D9D9"/>
+              <w:right w:val="single" w:sz="4" w:color="D9D9D9"/>
+            </w:tcBorders>
+            <w:tcMar>
+              <w:top w:w="90" w:type="dxa"/>
+              <w:left w:w="90" w:type="dxa"/>
+              <w:bottom w:w="90" w:type="dxa"/>
+              <w:right w:w="90" w:type="dxa"/>
+            </w:tcMar>
+          </w:tcPr>
+          <w:p>
+            <w:pPr>
+              <w:spacing w:after="20" w:before="20" w:line="264" w:lineRule="auto"/>
+            </w:pPr>
+            <w:r>
+              <w:rPr>
+                <w:b w:val="0"/>
+                <w:color w:val="000000"/>
+                <w:sz w:val="18"/>
+              </w:rPr>
+              <w:t>11/11</w:t>
+            </w:r>
+          </w:p>
+        </w:tc>
+        <w:tc>
+          <w:tcPr>
+            <w:tcW w:type="dxa" w:w="3231"/>
+            <w:vAlign w:val="center"/>
+            <w:tcBorders>
+              <w:top w:val="single" w:sz="4" w:color="D9D9D9"/>
+              <w:left w:val="single" w:sz="4" w:color="D9D9D9"/>
+              <w:bottom w:val="single" w:sz="4" w:color="D9D9D9"/>
+              <w:right w:val="single" w:sz="4" w:color="D9D9D9"/>
+            </w:tcBorders>
+            <w:tcMar>
+              <w:top w:w="90" w:type="dxa"/>
+              <w:left w:w="90" w:type="dxa"/>
+              <w:bottom w:w="90" w:type="dxa"/>
+              <w:right w:w="90" w:type="dxa"/>
+            </w:tcMar>
+          </w:tcPr>
+          <w:p>
+            <w:pPr>
+              <w:spacing w:after="20" w:before="20" w:line="264" w:lineRule="auto"/>
+            </w:pPr>
+            <w:r>
+              <w:rPr>
+                <w:b w:val="0"/>
+                <w:color w:val="000000"/>
+                <w:sz w:val="18"/>
+              </w:rPr>
+              <w:t>19.66 秒</w:t>
+            </w:r>
+          </w:p>
+        </w:tc>
+      </w:tr>
+    </w:tbl>
+    <w:p>
+      <w:pPr>
+        <w:spacing w:after="120" w:line="269" w:lineRule="auto"/>
+      </w:pPr>
+    </w:p>
+    <w:p>
+      <w:pPr>
+        <w:spacing w:after="120" w:line="269" w:lineRule="auto"/>
+      </w:pPr>
+      <w:r>
+        <w:t>完整契约检查涵盖决策、引用、缺失条件、原因码和版本链。基线未通过的 7 条中，5 条仅原因码不同；另 2 条选择 clarify 而非预期的 abstain，两组均承认信息不足。该差距不能写成事实准确率或安全性提升。本轮主要展示输出规范化与知识更新流程。</w:t>
+      </w:r>
+    </w:p>
+    <w:p>
+      <w:pPr>
+        <w:spacing w:after="120" w:line="269" w:lineRule="auto"/>
+      </w:pPr>
+      <w:r>
+        <w:t>CLI 耗时包含启动与网络开销，不能当作实时教练延迟。两组 input tokens 分别为 132744 与 162180，包含缓存；output tokens 为 1700 与 1722。没有将账号用量换算为 API 费用。最终输出未被脚本改写，也没有重试挑选答案。</w:t>
+      </w:r>
+    </w:p>
+    <w:p>
+      <w:pPr>
+        <w:pStyle w:val="Heading2"/>
+        <w:pageBreakBefore w:val="0"/>
+      </w:pPr>
+      <w:r>
+        <w:rPr>
+          <w:color w:val="000000"/>
+        </w:rPr>
+        <w:t>本地管理与回滚演练</w:t>
+      </w:r>
+    </w:p>
+    <w:p>
+      <w:pPr>
+        <w:spacing w:after="120" w:line="269" w:lineRule="auto"/>
+      </w:pPr>
+      <w:r>
+        <w:t>设备组合问题触发知识缺口记录。核对 Steam 原文后提出补录候选，依次演练 proposed、reviewed、evaluated 与 published。程序分别阻止未审核、未评测的提前发布，通过后才把本地 active 指针切到 enriched-v2；隔离副本回滚检查恢复 seed-v1。</w:t>
+      </w:r>
+    </w:p>
+    <w:p>
+      <w:pPr>
+        <w:spacing w:after="120" w:line="269" w:lineRule="auto"/>
+      </w:pPr>
+      <w:r>
+        <w:t>审批使用标注为 local_demo_fixture 的演练身份，助手核对公开来源，不等于真实企业审批或独立专家审定。两个知识快照是预先准备的离线评测素材，生产知识库发布仍需真实权限与审核服务。</w:t>
+      </w:r>
+    </w:p>
+    <w:p>
+      <w:pPr>
+        <w:pStyle w:val="Heading2"/>
+        <w:pageBreakBefore w:val="0"/>
+      </w:pPr>
+      <w:r>
+        <w:rPr>
+          <w:color w:val="000000"/>
+        </w:rPr>
+        <w:t>展示与复现</w:t>
+      </w:r>
+    </w:p>
+    <w:p>
+      <w:pPr>
+        <w:spacing w:after="80"/>
+      </w:pPr>
+      <w:hyperlink r:id="rId27">
+        <w:r>
+          <w:rPr>
+            <w:color w:val="165D47"/>
+          </w:rPr>
+          <w:t>打开 Biped Demo 实际运行回放</w:t>
+        </w:r>
+      </w:hyperlink>
+    </w:p>
+    <w:p>
+      <w:pPr>
+        <w:spacing w:after="80"/>
+      </w:pPr>
+      <w:hyperlink r:id="rId28">
+        <w:r>
+          <w:rPr>
+            <w:color w:val="165D47"/>
+          </w:rPr>
+          <w:t>查看模型记录 harness 与本地复现命令</w:t>
+        </w:r>
+      </w:hyperlink>
+    </w:p>
+    <w:p>
+      <w:pPr>
+        <w:spacing w:after="120" w:line="269" w:lineRule="auto"/>
+      </w:pPr>
+      <w:r>
+        <w:t>运行记录包含 manifest、逐条输入与 prompt、宿主轨迹、最终输出、公开事件、自动检查和管理演练。公开日志排除内部推理与传输 stderr；认证文件不入库。后续应扩充独立样本、做专家盲评和多次运行，再分别验证检索、感知与真实玩家体验。</w:t>
+      </w:r>
+    </w:p>
+    <w:p>
+      <w:pPr>
+        <w:pStyle w:val="Heading2"/>
+        <w:pageBreakBefore w:val="0"/>
+      </w:pPr>
+      <w:r>
+        <w:rPr>
+          <w:color w:val="000000"/>
+        </w:rPr>
+        <w:t>Demo 新增一手来源</w:t>
+      </w:r>
+    </w:p>
+    <w:p>
+      <w:pPr>
+        <w:spacing w:after="80"/>
+      </w:pPr>
+      <w:hyperlink r:id="rId29">
+        <w:r>
+          <w:rPr>
+            <w:color w:val="165D47"/>
+          </w:rPr>
+          <w:t>NExT Studios 官方介绍 腾讯归属与产品关系</w:t>
+        </w:r>
+      </w:hyperlink>
+    </w:p>
+    <w:p>
+      <w:pPr>
+        <w:spacing w:after="80"/>
+      </w:pPr>
+      <w:hyperlink r:id="rId30">
+        <w:r>
+          <w:rPr>
+            <w:color w:val="165D47"/>
+          </w:rPr>
+          <w:t>Biped Steam 游戏介绍与系统需求附注</w:t>
+        </w:r>
+      </w:hyperlink>
+    </w:p>
+    <w:p>
+      <w:pPr>
+        <w:spacing w:after="80"/>
+      </w:pPr>
+      <w:hyperlink r:id="rId31">
+        <w:r>
+          <w:rPr>
+            <w:color w:val="165D47"/>
+          </w:rPr>
+          <w:t>开发者 Biped 设计复盘 2020 年 3 月 27 日</w:t>
+        </w:r>
+      </w:hyperlink>
+    </w:p>
+    <w:p>
+      <w:pPr>
+        <w:spacing w:after="80"/>
+      </w:pPr>
+      <w:hyperlink r:id="rId32">
+        <w:r>
+          <w:rPr>
+            <w:color w:val="165D47"/>
+          </w:rPr>
+          <w:t>Codex 非交互模式官方文档</w:t>
+        </w:r>
+      </w:hyperlink>
     </w:p>
     <w:sectPr>
       <w:pgSz w:w="11906" w:h="16838"/>

</xml_diff>